<commit_message>
add chapter about Rust
</commit_message>
<xml_diff>
--- a/Курсовая.docx
+++ b/Курсовая.docx
@@ -11334,13 +11334,14 @@
     <w:p>
       <w:pPr>
         <w:spacing w:line="360" w:lineRule="auto"/>
-        <w:ind w:firstLine="360"/>
+        <w:ind w:firstLine="708"/>
         <w:jc w:val="both"/>
         <w:rPr>
           <w:rFonts w:ascii="Times New Roman" w:hAnsi="Times New Roman" w:cs="Times New Roman"/>
           <w:color w:val="000000" w:themeColor="text1"/>
           <w:sz w:val="28"/>
           <w:szCs w:val="28"/>
+          <w:lang w:val="en-US"/>
         </w:rPr>
       </w:pPr>
       <w:r>
@@ -11464,6 +11465,406 @@
           <w:szCs w:val="28"/>
         </w:rPr>
         <w:t>.</w:t>
+      </w:r>
+    </w:p>
+    <w:p>
+      <w:pPr>
+        <w:spacing w:line="360" w:lineRule="auto"/>
+        <w:ind w:firstLine="708"/>
+        <w:jc w:val="both"/>
+        <w:rPr>
+          <w:rFonts w:ascii="Times New Roman" w:hAnsi="Times New Roman" w:cs="Times New Roman"/>
+          <w:color w:val="000000" w:themeColor="text1"/>
+          <w:sz w:val="28"/>
+          <w:szCs w:val="28"/>
+        </w:rPr>
+      </w:pPr>
+      <w:r>
+        <w:rPr>
+          <w:rFonts w:ascii="Times New Roman" w:hAnsi="Times New Roman" w:cs="Times New Roman"/>
+          <w:color w:val="000000" w:themeColor="text1"/>
+          <w:sz w:val="28"/>
+          <w:szCs w:val="28"/>
+        </w:rPr>
+        <w:t xml:space="preserve">Помимо обеспечения безопасности и корректности работы, </w:t>
+      </w:r>
+      <w:r>
+        <w:rPr>
+          <w:rFonts w:ascii="Times New Roman" w:hAnsi="Times New Roman" w:cs="Times New Roman"/>
+          <w:color w:val="000000" w:themeColor="text1"/>
+          <w:sz w:val="28"/>
+          <w:szCs w:val="28"/>
+          <w:lang w:val="en-US"/>
+        </w:rPr>
+        <w:t>Rust</w:t>
+      </w:r>
+      <w:r>
+        <w:rPr>
+          <w:rFonts w:ascii="Times New Roman" w:hAnsi="Times New Roman" w:cs="Times New Roman"/>
+          <w:color w:val="000000" w:themeColor="text1"/>
+          <w:sz w:val="28"/>
+          <w:szCs w:val="28"/>
+        </w:rPr>
+        <w:t xml:space="preserve"> обладает рядом практических преимуществ, которые делают его подходящим для разработки высокопроизводительных библиотек, таких как </w:t>
+      </w:r>
+      <w:r>
+        <w:rPr>
+          <w:rFonts w:ascii="Times New Roman" w:hAnsi="Times New Roman" w:cs="Times New Roman"/>
+          <w:color w:val="FF0000"/>
+          <w:sz w:val="28"/>
+          <w:szCs w:val="28"/>
+        </w:rPr>
+        <w:t>[название библиотеки]</w:t>
+      </w:r>
+      <w:r>
+        <w:rPr>
+          <w:rFonts w:ascii="Times New Roman" w:hAnsi="Times New Roman" w:cs="Times New Roman"/>
+          <w:color w:val="000000" w:themeColor="text1"/>
+          <w:sz w:val="28"/>
+          <w:szCs w:val="28"/>
+        </w:rPr>
+        <w:t>.</w:t>
+      </w:r>
+      <w:r>
+        <w:rPr>
+          <w:rFonts w:ascii="Times New Roman" w:hAnsi="Times New Roman" w:cs="Times New Roman"/>
+          <w:color w:val="000000" w:themeColor="text1"/>
+          <w:sz w:val="28"/>
+          <w:szCs w:val="28"/>
+        </w:rPr>
+        <w:t xml:space="preserve"> </w:t>
+      </w:r>
+    </w:p>
+    <w:p>
+      <w:pPr>
+        <w:spacing w:line="360" w:lineRule="auto"/>
+        <w:ind w:firstLine="708"/>
+        <w:jc w:val="both"/>
+        <w:rPr>
+          <w:rFonts w:ascii="Times New Roman" w:hAnsi="Times New Roman" w:cs="Times New Roman"/>
+          <w:color w:val="000000" w:themeColor="text1"/>
+          <w:sz w:val="28"/>
+          <w:szCs w:val="28"/>
+        </w:rPr>
+      </w:pPr>
+      <w:r>
+        <w:rPr>
+          <w:rFonts w:ascii="Times New Roman" w:hAnsi="Times New Roman" w:cs="Times New Roman"/>
+          <w:color w:val="000000" w:themeColor="text1"/>
+          <w:sz w:val="28"/>
+          <w:szCs w:val="28"/>
+        </w:rPr>
+        <w:t xml:space="preserve">Во-первых, язык программирования </w:t>
+      </w:r>
+      <w:r>
+        <w:rPr>
+          <w:rFonts w:ascii="Times New Roman" w:hAnsi="Times New Roman" w:cs="Times New Roman"/>
+          <w:color w:val="000000" w:themeColor="text1"/>
+          <w:sz w:val="28"/>
+          <w:szCs w:val="28"/>
+          <w:lang w:val="en-US"/>
+        </w:rPr>
+        <w:t>Rust</w:t>
+      </w:r>
+      <w:r>
+        <w:rPr>
+          <w:rFonts w:ascii="Times New Roman" w:hAnsi="Times New Roman" w:cs="Times New Roman"/>
+          <w:color w:val="000000" w:themeColor="text1"/>
+          <w:sz w:val="28"/>
+          <w:szCs w:val="28"/>
+        </w:rPr>
+        <w:t xml:space="preserve"> обеспечивает производительность за счёт компиляции в машинный код и отсутствия накладных расходов, связанных со сборкой мусора</w:t>
+      </w:r>
+      <w:r>
+        <w:rPr>
+          <w:rFonts w:ascii="Times New Roman" w:hAnsi="Times New Roman" w:cs="Times New Roman"/>
+          <w:color w:val="000000" w:themeColor="text1"/>
+          <w:sz w:val="28"/>
+          <w:szCs w:val="28"/>
+        </w:rPr>
+        <w:t xml:space="preserve"> в ядре языка </w:t>
+      </w:r>
+      <w:r>
+        <w:rPr>
+          <w:rFonts w:ascii="Times New Roman" w:hAnsi="Times New Roman" w:cs="Times New Roman"/>
+          <w:color w:val="000000" w:themeColor="text1"/>
+          <w:sz w:val="28"/>
+          <w:szCs w:val="28"/>
+        </w:rPr>
+        <w:t>[5]</w:t>
+      </w:r>
+      <w:r>
+        <w:rPr>
+          <w:rFonts w:ascii="Times New Roman" w:hAnsi="Times New Roman" w:cs="Times New Roman"/>
+          <w:color w:val="000000" w:themeColor="text1"/>
+          <w:sz w:val="28"/>
+          <w:szCs w:val="28"/>
+        </w:rPr>
+        <w:t>. Это критически важно для задач обработки текстов, где необходимо хранить и анализировать большие объёмы данных с высокой скоростью, например при извлечении адресной информации из потоков документов.</w:t>
+      </w:r>
+    </w:p>
+    <w:p>
+      <w:pPr>
+        <w:spacing w:line="360" w:lineRule="auto"/>
+        <w:ind w:firstLine="708"/>
+        <w:jc w:val="both"/>
+        <w:rPr>
+          <w:rFonts w:ascii="Times New Roman" w:hAnsi="Times New Roman" w:cs="Times New Roman"/>
+          <w:color w:val="000000" w:themeColor="text1"/>
+          <w:sz w:val="28"/>
+          <w:szCs w:val="28"/>
+        </w:rPr>
+      </w:pPr>
+      <w:r>
+        <w:rPr>
+          <w:rFonts w:ascii="Times New Roman" w:hAnsi="Times New Roman" w:cs="Times New Roman"/>
+          <w:color w:val="000000" w:themeColor="text1"/>
+          <w:sz w:val="28"/>
+          <w:szCs w:val="28"/>
+        </w:rPr>
+        <w:t xml:space="preserve">Во-вторых, </w:t>
+      </w:r>
+      <w:r>
+        <w:rPr>
+          <w:rFonts w:ascii="Times New Roman" w:hAnsi="Times New Roman" w:cs="Times New Roman"/>
+          <w:color w:val="000000" w:themeColor="text1"/>
+          <w:sz w:val="28"/>
+          <w:szCs w:val="28"/>
+          <w:lang w:val="en-US"/>
+        </w:rPr>
+        <w:t>Rust</w:t>
+      </w:r>
+      <w:r>
+        <w:rPr>
+          <w:rFonts w:ascii="Times New Roman" w:hAnsi="Times New Roman" w:cs="Times New Roman"/>
+          <w:color w:val="000000" w:themeColor="text1"/>
+          <w:sz w:val="28"/>
+          <w:szCs w:val="28"/>
+        </w:rPr>
+        <w:t xml:space="preserve"> предоставляет развитые средства абстракции с нулевой </w:t>
+      </w:r>
+      <w:r>
+        <w:rPr>
+          <w:rFonts w:ascii="Times New Roman" w:hAnsi="Times New Roman" w:cs="Times New Roman"/>
+          <w:color w:val="000000" w:themeColor="text1"/>
+          <w:sz w:val="28"/>
+          <w:szCs w:val="28"/>
+        </w:rPr>
+        <w:t>стоимостью (</w:t>
+      </w:r>
+      <w:r>
+        <w:rPr>
+          <w:rFonts w:ascii="Times New Roman" w:hAnsi="Times New Roman" w:cs="Times New Roman"/>
+          <w:sz w:val="28"/>
+          <w:szCs w:val="28"/>
+        </w:rPr>
+        <w:t>zero-cost abstractions</w:t>
+      </w:r>
+      <w:r>
+        <w:rPr>
+          <w:rFonts w:ascii="Times New Roman" w:hAnsi="Times New Roman" w:cs="Times New Roman"/>
+          <w:color w:val="000000" w:themeColor="text1"/>
+          <w:sz w:val="28"/>
+          <w:szCs w:val="28"/>
+        </w:rPr>
+        <w:t>)</w:t>
+      </w:r>
+      <w:r>
+        <w:rPr>
+          <w:rFonts w:ascii="Times New Roman" w:hAnsi="Times New Roman" w:cs="Times New Roman"/>
+          <w:color w:val="000000" w:themeColor="text1"/>
+          <w:sz w:val="28"/>
+          <w:szCs w:val="28"/>
+        </w:rPr>
+        <w:t xml:space="preserve">, позволяющие строить сложные архитектурные решения без потери производительности. Это даёт возможность </w:t>
+      </w:r>
+      <w:r>
+        <w:rPr>
+          <w:rFonts w:ascii="Times New Roman" w:hAnsi="Times New Roman" w:cs="Times New Roman"/>
+          <w:color w:val="000000" w:themeColor="text1"/>
+          <w:sz w:val="28"/>
+          <w:szCs w:val="28"/>
+        </w:rPr>
+        <w:t xml:space="preserve">реализовать модульную и расширяемую архитектуру парсера, аналогичную </w:t>
+      </w:r>
+      <w:r>
+        <w:rPr>
+          <w:rFonts w:ascii="Times New Roman" w:hAnsi="Times New Roman" w:cs="Times New Roman"/>
+          <w:color w:val="000000" w:themeColor="text1"/>
+          <w:sz w:val="28"/>
+          <w:szCs w:val="28"/>
+          <w:lang w:val="en-US"/>
+        </w:rPr>
+        <w:t>Yargy</w:t>
+      </w:r>
+      <w:r>
+        <w:rPr>
+          <w:rFonts w:ascii="Times New Roman" w:hAnsi="Times New Roman" w:cs="Times New Roman"/>
+          <w:color w:val="000000" w:themeColor="text1"/>
+          <w:sz w:val="28"/>
+          <w:szCs w:val="28"/>
+        </w:rPr>
+        <w:t>, сохраняя при этом высокую эффективность исполнения.</w:t>
+      </w:r>
+    </w:p>
+    <w:p>
+      <w:pPr>
+        <w:spacing w:line="360" w:lineRule="auto"/>
+        <w:ind w:firstLine="708"/>
+        <w:jc w:val="both"/>
+        <w:rPr>
+          <w:rFonts w:ascii="Times New Roman" w:hAnsi="Times New Roman" w:cs="Times New Roman"/>
+          <w:color w:val="000000" w:themeColor="text1"/>
+          <w:sz w:val="28"/>
+          <w:szCs w:val="28"/>
+        </w:rPr>
+      </w:pPr>
+      <w:r>
+        <w:rPr>
+          <w:rFonts w:ascii="Times New Roman" w:hAnsi="Times New Roman" w:cs="Times New Roman"/>
+          <w:color w:val="000000" w:themeColor="text1"/>
+          <w:sz w:val="28"/>
+          <w:szCs w:val="28"/>
+        </w:rPr>
+        <w:t xml:space="preserve">Кроме того, </w:t>
+      </w:r>
+      <w:r>
+        <w:rPr>
+          <w:rFonts w:ascii="Times New Roman" w:hAnsi="Times New Roman" w:cs="Times New Roman"/>
+          <w:color w:val="000000" w:themeColor="text1"/>
+          <w:sz w:val="28"/>
+          <w:szCs w:val="28"/>
+          <w:lang w:val="en-US"/>
+        </w:rPr>
+        <w:t>Rust</w:t>
+      </w:r>
+      <w:r>
+        <w:rPr>
+          <w:rFonts w:ascii="Times New Roman" w:hAnsi="Times New Roman" w:cs="Times New Roman"/>
+          <w:color w:val="000000" w:themeColor="text1"/>
+          <w:sz w:val="28"/>
+          <w:szCs w:val="28"/>
+        </w:rPr>
+        <w:t xml:space="preserve"> обеспечивает удобные средства для построения безопасных и эффективных многопоточных решений, что позволяет масштабировать обработку данных и использовать </w:t>
+      </w:r>
+      <w:r>
+        <w:rPr>
+          <w:rFonts w:ascii="Times New Roman" w:hAnsi="Times New Roman" w:cs="Times New Roman"/>
+          <w:color w:val="000000" w:themeColor="text1"/>
+          <w:sz w:val="28"/>
+          <w:szCs w:val="28"/>
+        </w:rPr>
+        <w:t>возможности современных многоядерных процессоров без риска возникновения трудноуловимых ошибок.</w:t>
+      </w:r>
+    </w:p>
+    <w:p>
+      <w:pPr>
+        <w:spacing w:line="360" w:lineRule="auto"/>
+        <w:ind w:firstLine="708"/>
+        <w:jc w:val="both"/>
+        <w:rPr>
+          <w:rFonts w:ascii="Times New Roman" w:hAnsi="Times New Roman" w:cs="Times New Roman"/>
+          <w:color w:val="000000" w:themeColor="text1"/>
+          <w:sz w:val="28"/>
+          <w:szCs w:val="28"/>
+        </w:rPr>
+      </w:pPr>
+      <w:r>
+        <w:rPr>
+          <w:rFonts w:ascii="Times New Roman" w:hAnsi="Times New Roman" w:cs="Times New Roman"/>
+          <w:color w:val="000000" w:themeColor="text1"/>
+          <w:sz w:val="28"/>
+          <w:szCs w:val="28"/>
+        </w:rPr>
+        <w:t>Стоит отметить, что развитая экосистема инструментов (</w:t>
+      </w:r>
+      <w:r>
+        <w:rPr>
+          <w:rFonts w:ascii="Times New Roman" w:hAnsi="Times New Roman" w:cs="Times New Roman"/>
+          <w:color w:val="000000" w:themeColor="text1"/>
+          <w:sz w:val="28"/>
+          <w:szCs w:val="28"/>
+          <w:lang w:val="en-US"/>
+        </w:rPr>
+        <w:t>Cargo</w:t>
+      </w:r>
+      <w:r>
+        <w:rPr>
+          <w:rFonts w:ascii="Times New Roman" w:hAnsi="Times New Roman" w:cs="Times New Roman"/>
+          <w:color w:val="000000" w:themeColor="text1"/>
+          <w:sz w:val="28"/>
+          <w:szCs w:val="28"/>
+        </w:rPr>
+        <w:t xml:space="preserve">, встроенная система тестирования, генерация документации) способствует ускорению разработки, сопровождения и верификации программного </w:t>
+      </w:r>
+      <w:r>
+        <w:rPr>
+          <w:rFonts w:ascii="Times New Roman" w:hAnsi="Times New Roman" w:cs="Times New Roman"/>
+          <w:color w:val="000000" w:themeColor="text1"/>
+          <w:sz w:val="28"/>
+          <w:szCs w:val="28"/>
+        </w:rPr>
+        <w:lastRenderedPageBreak/>
+        <w:t>обеспечивания, что является важным фактором при создании исследовательских и прикладных программ.</w:t>
+      </w:r>
+    </w:p>
+    <w:p>
+      <w:pPr>
+        <w:spacing w:line="360" w:lineRule="auto"/>
+        <w:ind w:firstLine="708"/>
+        <w:jc w:val="both"/>
+        <w:rPr>
+          <w:rFonts w:ascii="Times New Roman" w:hAnsi="Times New Roman" w:cs="Times New Roman"/>
+          <w:color w:val="000000" w:themeColor="text1"/>
+          <w:sz w:val="28"/>
+          <w:szCs w:val="28"/>
+        </w:rPr>
+      </w:pPr>
+      <w:r>
+        <w:rPr>
+          <w:rFonts w:ascii="Times New Roman" w:hAnsi="Times New Roman" w:cs="Times New Roman"/>
+          <w:color w:val="000000" w:themeColor="text1"/>
+          <w:sz w:val="28"/>
+          <w:szCs w:val="28"/>
+        </w:rPr>
+        <w:t xml:space="preserve">Таким образом, выбор </w:t>
+      </w:r>
+      <w:r>
+        <w:rPr>
+          <w:rFonts w:ascii="Times New Roman" w:hAnsi="Times New Roman" w:cs="Times New Roman"/>
+          <w:color w:val="000000" w:themeColor="text1"/>
+          <w:sz w:val="28"/>
+          <w:szCs w:val="28"/>
+          <w:lang w:val="en-US"/>
+        </w:rPr>
+        <w:t>Rust</w:t>
+      </w:r>
+      <w:r>
+        <w:rPr>
+          <w:rFonts w:ascii="Times New Roman" w:hAnsi="Times New Roman" w:cs="Times New Roman"/>
+          <w:color w:val="000000" w:themeColor="text1"/>
+          <w:sz w:val="28"/>
+          <w:szCs w:val="28"/>
+        </w:rPr>
+        <w:t xml:space="preserve"> в качестве языка реализации </w:t>
+      </w:r>
+      <w:r>
+        <w:rPr>
+          <w:rFonts w:ascii="Times New Roman" w:hAnsi="Times New Roman" w:cs="Times New Roman"/>
+          <w:color w:val="FF0000"/>
+          <w:sz w:val="28"/>
+          <w:szCs w:val="28"/>
+        </w:rPr>
+        <w:t>[название библиотеки]</w:t>
+      </w:r>
+      <w:r>
+        <w:rPr>
+          <w:rFonts w:ascii="Times New Roman" w:hAnsi="Times New Roman" w:cs="Times New Roman"/>
+          <w:color w:val="000000" w:themeColor="text1"/>
+          <w:sz w:val="28"/>
+          <w:szCs w:val="28"/>
+        </w:rPr>
+        <w:t xml:space="preserve"> обусловлен сочетанием высокой производительности, безопасности и удобства разработки, что делает этот язык программирования эффективной основой для построения промышленного синтаксического анализатора.</w:t>
       </w:r>
     </w:p>
     <w:p>
@@ -11832,29 +12233,7 @@
             <w:szCs w:val="28"/>
             <w:shd w:val="clear" w:color="auto" w:fill="FFFFFF"/>
           </w:rPr>
-          <w:t>ISBN</w:t>
-        </w:r>
-        <w:r>
-          <w:rPr>
-            <w:rStyle w:val="a7"/>
-            <w:rFonts w:ascii="Times New Roman" w:hAnsi="Times New Roman" w:cs="Times New Roman"/>
-            <w:color w:val="3366CC"/>
-            <w:sz w:val="28"/>
-            <w:szCs w:val="28"/>
-            <w:shd w:val="clear" w:color="auto" w:fill="FFFFFF"/>
-          </w:rPr>
-          <w:t xml:space="preserve"> </w:t>
-        </w:r>
-        <w:r>
-          <w:rPr>
-            <w:rStyle w:val="a7"/>
-            <w:rFonts w:ascii="Times New Roman" w:hAnsi="Times New Roman" w:cs="Times New Roman"/>
-            <w:color w:val="3366CC"/>
-            <w:sz w:val="28"/>
-            <w:szCs w:val="28"/>
-            <w:shd w:val="clear" w:color="auto" w:fill="FFFFFF"/>
-          </w:rPr>
-          <w:t>978-5-97060-236-2</w:t>
+          <w:t>ISBN 978-5-97060-236-2</w:t>
         </w:r>
       </w:hyperlink>
       <w:r>
@@ -12036,7 +12415,7 @@
             <w:rPr>
               <w:noProof/>
             </w:rPr>
-            <w:t>24</w:t>
+            <w:t>25</w:t>
           </w:r>
         </w:fldSimple>
       </w:p>

</xml_diff>